<commit_message>
Gestor: Requerimentos com seletor Rural/Urbano que ajusta a redacao dos documentos
- Novo seletor "Tipo de imovel" (Rural/Urbano) na aba Requerimentos, auto-preenchido
  a partir do cadastro da obra (codigo_incra_tipo).
- Qualificacao adapta: "imovel rural ... no INCRA sob o codigo" vs
  "imovel urbano ... na Prefeitura sob a inscricao municipal".
- Label do campo do codigo tambem adapta (INCRA/SNCR vs Inscricao Municipal).
- Declaracoes do profissional e do art.213 agora usam placeholders TIPO_IMOVEL e
  ORGAO_CADASTRO (templates regenerados).

Co-Authored-By: Claude Opus 4.8 <noreply@anthropic.com>
</commit_message>
<xml_diff>
--- a/gestor/templates/declaracao_responsabilidade_profissional_modelo.docx
+++ b/gestor/templates/declaracao_responsabilidade_profissional_modelo.docx
@@ -44,7 +44,7 @@
         <w:rPr>
           <w:rFonts w:cs="Arial"/>
         </w:rPr>
-        <w:t xml:space="preserve">, na qualidade de responsável técnico credenciado pela execução do levantamento topográfico georreferenciado e pela elaboração da planta e do memorial descritivo do imóvel rural denominado </w:t>
+        <w:t xml:space="preserve">, na qualidade de responsável técnico credenciado pela execução do levantamento topográfico georreferenciado e pela elaboração da planta e do memorial descritivo do imóvel {{TIPO_IMOVEL}} denominado </w:t>
       </w:r>
       <w:r>
         <w:rPr>
@@ -72,7 +72,7 @@
         <w:rPr>
           <w:rFonts w:cs="Arial"/>
         </w:rPr>
-        <w:t xml:space="preserve">, da comarca de {{COMARCA}}, cadastrado no INCRA/SNCR sob o código n° {{CODIGO_INCRA}}, </w:t>
+        <w:t xml:space="preserve">, da comarca de {{COMARCA}}, cadastrado {{ORGAO_CADASTRO}} n° {{CODIGO_INCRA}}, </w:t>
       </w:r>
       <w:r>
         <w:rPr>

</xml_diff>